<commit_message>
MP3 Part B: apply QA fixes from specs/MP3_fixes.md
- Rebuild .docx files to pick up v2 build-script wording already in
  source (two checkpoints, ≥3 invocations)
- Replace RUBRIC_MP3_PartB.md with deliverable-based version
  (S/M/A/R prefixes, sums to 50; "One Polished Skill" matches the
  v2 assignment scope; criteria S.1–S.2 written for one skill,
  S.3–S.8 unchanged as quality criteria)
- Add skills_starter/miniclaw_skill_template.md (DFM-check template
  students copy and rewrite for their own skill topic)
- mcp_server_starter/README.md: ≥5 → ≥3 invocations to match rubric M.4
- mcp_server_starter/server.py: silence FastMCP's httpx PyPI ping so
  server.log only contains MiniClaw tool calls
</commit_message>
<xml_diff>
--- a/MP3/Part B/MP3_PartB_Productize_Memo.docx
+++ b/MP3/Part B/MP3_PartB_Productize_Memo.docx
@@ -303,7 +303,7 @@
           <w:rFonts w:ascii="Calibri" w:hAnsi="Calibri"/>
           <w:sz w:val="22"/>
         </w:rPr>
-        <w:t>Write down the workflow patterns you've developed — what to check on a gear design, when to pull from BigClaw reference, what DFM constraints matter for our print shop. Format these so an AI session can apply them without you being there. Industry calls these “skills” right now; the format will keep evolving but the idea is durable.</w:t>
+        <w:t>Write down a workflow pattern you've developed — what to check on a gear design, when to pull from BigClaw reference, what DFM constraints matter for our print shop. Pick the one that's been most useful to you and turn it into a reusable artifact. Format it so an AI session can apply it without you being there. Industry calls these “skills” right now; the format will keep evolving but the idea is durable.</w:t>
       </w:r>
     </w:p>
     <w:p>
@@ -323,7 +323,7 @@
           <w:rFonts w:ascii="Calibri" w:hAnsi="Calibri"/>
           <w:sz w:val="22"/>
         </w:rPr>
-        <w:t>Pick a subassembly — gear train, jaw arms, the housing, doesn't matter which. Spend a few hours iterating it in whatever CAD tool you prefer (SolidWorks, Fusion, OpenSCAD — your call). Use your productized stack alongside you. Document three checkpoints where you stopped, sent the AI a screenshot with your skills loaded, and got a review. I want to see what the AI caught, what it missed, and what you changed.</w:t>
+        <w:t>Pick a subassembly — gear train, jaw arms, the housing, doesn't matter which. Spend a few hours iterating it in whatever CAD tool you prefer (SolidWorks, Fusion, OpenSCAD — your call). Use your productized stack alongside you. Document a couple of checkpoints where you stopped, sent the AI a screenshot with your skill loaded, and got a review. I want to see what the AI caught, what it missed, and what you changed.</w:t>
       </w:r>
     </w:p>
     <w:p>

</xml_diff>